<commit_message>
Add iPad PWA and update documentation
- pwa/: New Vite + vite-plugin-pwa project for iPad deployment
  - API key entered on first launch and stored in localStorage
  - Service worker + web manifest for Add to Home Screen support
  - iPad-optimised CSS (safe-area insets, 44px touch targets, viewport fixes)
  - Setup screen (ApiKeySetup.jsx) shown on first run if no key is present
  - Bundle patched to read x-api-key from localStorage instead of .env
- Updated ppa-speech-therapy-docs.docx: new PWA layer row in tech stack,
  new PWA/iPad row in API key table, new Section 9.3 covering file layout,
  key patch, run/install steps, and service worker HTTPS note
- Updated ppa-speech-therapy-user-guide.docx: Installing on iPad section
  in Getting Started, two new iPad troubleshooting entries

Co-Authored-By: Claude Sonnet 4.6 <noreply@anthropic.com>
</commit_message>
<xml_diff>
--- a/ppa-speech-therapy-docs.docx
+++ b/ppa-speech-therapy-docs.docx
@@ -129,7 +129,7 @@
                 <w:sz w:val="22"/>
                 <w:szCs w:val="22"/>
               </w:rPr>
-              <w:t xml:space="preserve">Runs as a Claude.ai artifact or locally via Vite.  Powered by Claude Sonnet.</w:t>
+              <w:t xml:space="preserve">Runs as a Claude.ai artifact, locally via Vite, or as a PWA on iPad.  Powered by Claude Sonnet.</w:t>
             </w:r>
           </w:p>
         </w:tc>
@@ -391,6 +391,72 @@
                 <w:szCs w:val="20"/>
               </w:rPr>
               <w:t xml:space="preserve">Vite 5+</w:t>
+            </w:r>
+          </w:p>
+        </w:tc>
+      </w:tr>
+      <w:tr>
+        <w:tc>
+          <w:tcPr>
+            <w:tcW w:type="dxa" w:w="3000"/>
+            <w:tcBorders>
+              <w:top w:val="single" w:color="D8D4CC" w:sz="4"/>
+              <w:left w:val="single" w:color="D8D4CC" w:sz="4"/>
+              <w:bottom w:val="single" w:color="D8D4CC" w:sz="4"/>
+              <w:right w:val="single" w:color="D8D4CC" w:sz="4"/>
+            </w:tcBorders>
+            <w:shd w:fill="FFFFFF" w:val="clear"/>
+            <w:tcMar>
+              <w:top w:type="dxa" w:w="120"/>
+              <w:left w:type="dxa" w:w="160"/>
+              <w:bottom w:type="dxa" w:w="120"/>
+              <w:right w:type="dxa" w:w="120"/>
+            </w:tcMar>
+          </w:tcPr>
+          <w:p>
+            <w:pPr>
+              <w:spacing w:before="40" w:after="40"/>
+            </w:pPr>
+            <w:r>
+              <w:rPr>
+                <w:rFonts w:ascii="Arial" w:cs="Arial" w:eastAsia="Arial" w:hAnsi="Arial"/>
+                <w:color w:val="1A2820"/>
+                <w:sz w:val="20"/>
+                <w:szCs w:val="20"/>
+              </w:rPr>
+              <w:t xml:space="preserve">PWA layer</w:t>
+            </w:r>
+          </w:p>
+        </w:tc>
+        <w:tc>
+          <w:tcPr>
+            <w:tcW w:type="dxa" w:w="6360"/>
+            <w:tcBorders>
+              <w:top w:val="single" w:color="D8D4CC" w:sz="4"/>
+              <w:left w:val="single" w:color="D8D4CC" w:sz="4"/>
+              <w:bottom w:val="single" w:color="D8D4CC" w:sz="4"/>
+              <w:right w:val="single" w:color="D8D4CC" w:sz="4"/>
+            </w:tcBorders>
+            <w:shd w:fill="FFFFFF" w:val="clear"/>
+            <w:tcMar>
+              <w:top w:type="dxa" w:w="120"/>
+              <w:left w:type="dxa" w:w="160"/>
+              <w:bottom w:type="dxa" w:w="120"/>
+              <w:right w:type="dxa" w:w="120"/>
+            </w:tcMar>
+          </w:tcPr>
+          <w:p>
+            <w:pPr>
+              <w:spacing w:before="40" w:after="40"/>
+            </w:pPr>
+            <w:r>
+              <w:rPr>
+                <w:rFonts w:ascii="Arial" w:cs="Arial" w:eastAsia="Arial" w:hAnsi="Arial"/>
+                <w:color w:val="1A2820"/>
+                <w:sz w:val="20"/>
+                <w:szCs w:val="20"/>
+              </w:rPr>
+              <w:t xml:space="preserve">vite-plugin-pwa (Workbox service worker + web manifest) — installable on iPad via Safari</w:t>
             </w:r>
           </w:p>
         </w:tc>
@@ -2851,6 +2917,72 @@
                 <w:szCs w:val="20"/>
               </w:rPr>
               <w:t xml:space="preserve">VITE_ANTHROPIC_API_KEY in .env at project root (not src/)</w:t>
+            </w:r>
+          </w:p>
+        </w:tc>
+      </w:tr>
+      <w:tr>
+        <w:tc>
+          <w:tcPr>
+            <w:tcW w:type="dxa" w:w="3000"/>
+            <w:tcBorders>
+              <w:top w:val="single" w:color="D8D4CC" w:sz="4"/>
+              <w:left w:val="single" w:color="D8D4CC" w:sz="4"/>
+              <w:bottom w:val="single" w:color="D8D4CC" w:sz="4"/>
+              <w:right w:val="single" w:color="D8D4CC" w:sz="4"/>
+            </w:tcBorders>
+            <w:shd w:fill="FFFFFF" w:val="clear"/>
+            <w:tcMar>
+              <w:top w:type="dxa" w:w="120"/>
+              <w:left w:type="dxa" w:w="160"/>
+              <w:bottom w:type="dxa" w:w="120"/>
+              <w:right w:type="dxa" w:w="120"/>
+            </w:tcMar>
+          </w:tcPr>
+          <w:p>
+            <w:pPr>
+              <w:spacing w:before="40" w:after="40"/>
+            </w:pPr>
+            <w:r>
+              <w:rPr>
+                <w:rFonts w:ascii="Arial" w:cs="Arial" w:eastAsia="Arial" w:hAnsi="Arial"/>
+                <w:color w:val="1A2820"/>
+                <w:sz w:val="20"/>
+                <w:szCs w:val="20"/>
+              </w:rPr>
+              <w:t xml:space="preserve">PWA / iPad</w:t>
+            </w:r>
+          </w:p>
+        </w:tc>
+        <w:tc>
+          <w:tcPr>
+            <w:tcW w:type="dxa" w:w="6360"/>
+            <w:tcBorders>
+              <w:top w:val="single" w:color="D8D4CC" w:sz="4"/>
+              <w:left w:val="single" w:color="D8D4CC" w:sz="4"/>
+              <w:bottom w:val="single" w:color="D8D4CC" w:sz="4"/>
+              <w:right w:val="single" w:color="D8D4CC" w:sz="4"/>
+            </w:tcBorders>
+            <w:shd w:fill="FFFFFF" w:val="clear"/>
+            <w:tcMar>
+              <w:top w:type="dxa" w:w="120"/>
+              <w:left w:type="dxa" w:w="160"/>
+              <w:bottom w:type="dxa" w:w="120"/>
+              <w:right w:type="dxa" w:w="120"/>
+            </w:tcMar>
+          </w:tcPr>
+          <w:p>
+            <w:pPr>
+              <w:spacing w:before="40" w:after="40"/>
+            </w:pPr>
+            <w:r>
+              <w:rPr>
+                <w:rFonts w:ascii="Arial" w:cs="Arial" w:eastAsia="Arial" w:hAnsi="Arial"/>
+                <w:color w:val="1A2820"/>
+                <w:sz w:val="20"/>
+                <w:szCs w:val="20"/>
+              </w:rPr>
+              <w:t xml:space="preserve">localStorage.getItem(“ppa_api_key”) — entered on first launch via setup screen, stored in browser</w:t>
             </w:r>
           </w:p>
         </w:tc>
@@ -16459,6 +16591,441 @@
     <w:p>
       <w:r>
         <w:br w:type="page"/>
+      </w:r>
+    </w:p>
+    <w:p>
+      <w:pPr>
+        <w:pStyle w:val="Heading1"/>
+        <w:spacing w:before="400" w:after="120"/>
+      </w:pPr>
+      <w:r>
+        <w:rPr>
+          <w:rFonts w:ascii="Arial" w:cs="Arial" w:eastAsia="Arial" w:hAnsi="Arial"/>
+          <w:b/>
+          <w:bCs/>
+          <w:color w:val="2D5A54"/>
+          <w:sz w:val="34"/>
+          <w:szCs w:val="34"/>
+        </w:rPr>
+        <w:t xml:space="preserve">9.3  PWA / iPad Installation</w:t>
+      </w:r>
+    </w:p>
+    <w:p>
+      <w:pPr>
+        <w:spacing w:before="60" w:after="60"/>
+      </w:pPr>
+      <w:r>
+        <w:rPr>
+          <w:rFonts w:ascii="Arial" w:cs="Arial" w:eastAsia="Arial" w:hAnsi="Arial"/>
+          <w:color w:val="2D3B36"/>
+          <w:sz w:val="20"/>
+          <w:szCs w:val="20"/>
+        </w:rPr>
+        <w:t xml:space="preserve">The pwa/ directory contains a standalone Vite project configured for Progressive Web App deployment. It wraps the same bundle used by the desktop installer, with two differences: the Anthropic API key is read from localStorage (“ppa_api_key”) rather than a .env variable, and a service-worker + web manifest are included so the app can be installed from Safari on iPad.</w:t>
+      </w:r>
+    </w:p>
+    <w:p>
+      <w:pPr>
+        <w:pStyle w:val="Heading3"/>
+        <w:spacing w:before="240" w:after="80"/>
+      </w:pPr>
+      <w:r>
+        <w:rPr>
+          <w:rFonts w:ascii="Arial" w:cs="Arial" w:eastAsia="Arial" w:hAnsi="Arial"/>
+          <w:b/>
+          <w:bCs/>
+          <w:color w:val="4E8B80"/>
+          <w:sz w:val="22"/>
+          <w:szCs w:val="22"/>
+        </w:rPr>
+        <w:t xml:space="preserve">pwa/ file structure</w:t>
+      </w:r>
+    </w:p>
+    <w:p>
+      <w:pPr>
+        <w:spacing w:before="40" w:after="40"/>
+      </w:pPr>
+      <w:r>
+        <w:rPr>
+          <w:rFonts w:ascii="Courier New" w:cs="Courier New" w:eastAsia="Courier New" w:hAnsi="Courier New"/>
+          <w:color w:val="2D3B36"/>
+          <w:sz w:val="18"/>
+          <w:szCs w:val="18"/>
+        </w:rPr>
+        <w:t xml:space="preserve">pwa/</w:t>
+      </w:r>
+    </w:p>
+    <w:p>
+      <w:pPr>
+        <w:spacing w:before="40" w:after="40"/>
+      </w:pPr>
+      <w:r>
+        <w:rPr>
+          <w:rFonts w:ascii="Courier New" w:cs="Courier New" w:eastAsia="Courier New" w:hAnsi="Courier New"/>
+          <w:color w:val="2D3B36"/>
+          <w:sz w:val="18"/>
+          <w:szCs w:val="18"/>
+        </w:rPr>
+        <w:t xml:space="preserve">  src/</w:t>
+      </w:r>
+    </w:p>
+    <w:p>
+      <w:pPr>
+        <w:spacing w:before="40" w:after="40"/>
+      </w:pPr>
+      <w:r>
+        <w:rPr>
+          <w:rFonts w:ascii="Courier New" w:cs="Courier New" w:eastAsia="Courier New" w:hAnsi="Courier New"/>
+          <w:color w:val="2D3B36"/>
+          <w:sz w:val="18"/>
+          <w:szCs w:val="18"/>
+        </w:rPr>
+        <w:t xml:space="preserve">    main.jsx                      React entry point</w:t>
+      </w:r>
+    </w:p>
+    <w:p>
+      <w:pPr>
+        <w:spacing w:before="40" w:after="40"/>
+      </w:pPr>
+      <w:r>
+        <w:rPr>
+          <w:rFonts w:ascii="Courier New" w:cs="Courier New" w:eastAsia="Courier New" w:hAnsi="Courier New"/>
+          <w:color w:val="2D3B36"/>
+          <w:sz w:val="18"/>
+          <w:szCs w:val="18"/>
+        </w:rPr>
+        <w:t xml:space="preserve">    App.jsx                       API key gate → renders bundle</w:t>
+      </w:r>
+    </w:p>
+    <w:p>
+      <w:pPr>
+        <w:spacing w:before="40" w:after="40"/>
+      </w:pPr>
+      <w:r>
+        <w:rPr>
+          <w:rFonts w:ascii="Courier New" w:cs="Courier New" w:eastAsia="Courier New" w:hAnsi="Courier New"/>
+          <w:color w:val="2D3B36"/>
+          <w:sz w:val="18"/>
+          <w:szCs w:val="18"/>
+        </w:rPr>
+        <w:t xml:space="preserve">    ApiKeySetup.jsx               First-run API key onboarding screen</w:t>
+      </w:r>
+    </w:p>
+    <w:p>
+      <w:pPr>
+        <w:spacing w:before="40" w:after="40"/>
+      </w:pPr>
+      <w:r>
+        <w:rPr>
+          <w:rFonts w:ascii="Courier New" w:cs="Courier New" w:eastAsia="Courier New" w:hAnsi="Courier New"/>
+          <w:color w:val="2D3B36"/>
+          <w:sz w:val="18"/>
+          <w:szCs w:val="18"/>
+        </w:rPr>
+        <w:t xml:space="preserve">    index.css                     iPad-optimised styles (safe-area, touch targets)</w:t>
+      </w:r>
+    </w:p>
+    <w:p>
+      <w:pPr>
+        <w:spacing w:before="40" w:after="40"/>
+      </w:pPr>
+      <w:r>
+        <w:rPr>
+          <w:rFonts w:ascii="Courier New" w:cs="Courier New" w:eastAsia="Courier New" w:hAnsi="Courier New"/>
+          <w:color w:val="2D3B36"/>
+          <w:sz w:val="18"/>
+          <w:szCs w:val="18"/>
+        </w:rPr>
+        <w:t xml:space="preserve">    ppa-speech-therapy-bundle.jsx Patched bundle (localStorage API key)</w:t>
+      </w:r>
+    </w:p>
+    <w:p>
+      <w:pPr>
+        <w:spacing w:before="40" w:after="40"/>
+      </w:pPr>
+      <w:r>
+        <w:rPr>
+          <w:rFonts w:ascii="Courier New" w:cs="Courier New" w:eastAsia="Courier New" w:hAnsi="Courier New"/>
+          <w:color w:val="2D3B36"/>
+          <w:sz w:val="18"/>
+          <w:szCs w:val="18"/>
+        </w:rPr>
+        <w:t xml:space="preserve">  public/icons/                   App icons (SVG + PNG 120/152/192/512px)</w:t>
+      </w:r>
+    </w:p>
+    <w:p>
+      <w:pPr>
+        <w:spacing w:before="40" w:after="40"/>
+      </w:pPr>
+      <w:r>
+        <w:rPr>
+          <w:rFonts w:ascii="Courier New" w:cs="Courier New" w:eastAsia="Courier New" w:hAnsi="Courier New"/>
+          <w:color w:val="2D3B36"/>
+          <w:sz w:val="18"/>
+          <w:szCs w:val="18"/>
+        </w:rPr>
+        <w:t xml:space="preserve">  index.html                      Viewport + Apple PWA meta tags</w:t>
+      </w:r>
+    </w:p>
+    <w:p>
+      <w:pPr>
+        <w:spacing w:before="40" w:after="40"/>
+      </w:pPr>
+      <w:r>
+        <w:rPr>
+          <w:rFonts w:ascii="Courier New" w:cs="Courier New" w:eastAsia="Courier New" w:hAnsi="Courier New"/>
+          <w:color w:val="2D3B36"/>
+          <w:sz w:val="18"/>
+          <w:szCs w:val="18"/>
+        </w:rPr>
+        <w:t xml:space="preserve">  vite.config.js                  Vite + vite-plugin-pwa config</w:t>
+      </w:r>
+    </w:p>
+    <w:p>
+      <w:pPr>
+        <w:pStyle w:val="Heading3"/>
+        <w:spacing w:before="240" w:after="80"/>
+      </w:pPr>
+      <w:r>
+        <w:rPr>
+          <w:rFonts w:ascii="Arial" w:cs="Arial" w:eastAsia="Arial" w:hAnsi="Arial"/>
+          <w:b/>
+          <w:bCs/>
+          <w:color w:val="4E8B80"/>
+          <w:sz w:val="22"/>
+          <w:szCs w:val="22"/>
+        </w:rPr>
+        <w:t xml:space="preserve">API key patch</w:t>
+      </w:r>
+    </w:p>
+    <w:p>
+      <w:pPr>
+        <w:spacing w:before="60" w:after="60"/>
+      </w:pPr>
+      <w:r>
+        <w:rPr>
+          <w:rFonts w:ascii="Arial" w:cs="Arial" w:eastAsia="Arial" w:hAnsi="Arial"/>
+          <w:color w:val="2D3B36"/>
+          <w:sz w:val="20"/>
+          <w:szCs w:val="20"/>
+        </w:rPr>
+        <w:t xml:space="preserve">The bundle is generated from the same source as the desktop installer, then patched by replacing the two occurrences of:</w:t>
+      </w:r>
+    </w:p>
+    <w:p>
+      <w:pPr>
+        <w:spacing w:before="40" w:after="40"/>
+      </w:pPr>
+      <w:r>
+        <w:rPr>
+          <w:rFonts w:ascii="Courier New" w:cs="Courier New" w:eastAsia="Courier New" w:hAnsi="Courier New"/>
+          <w:color w:val="2D3B36"/>
+          <w:sz w:val="18"/>
+          <w:szCs w:val="18"/>
+        </w:rPr>
+        <w:t xml:space="preserve">headers: { "Content-Type": "application/json" },</w:t>
+      </w:r>
+    </w:p>
+    <w:p>
+      <w:pPr>
+        <w:spacing w:before="60" w:after="20"/>
+      </w:pPr>
+      <w:r>
+        <w:rPr>
+          <w:rFonts w:ascii="Arial" w:cs="Arial" w:eastAsia="Arial" w:hAnsi="Arial"/>
+          <w:color w:val="2D3B36"/>
+          <w:sz w:val="20"/>
+          <w:szCs w:val="20"/>
+        </w:rPr>
+        <w:t xml:space="preserve">with:</w:t>
+      </w:r>
+    </w:p>
+    <w:p>
+      <w:pPr>
+        <w:spacing w:before="40" w:after="40"/>
+      </w:pPr>
+      <w:r>
+        <w:rPr>
+          <w:rFonts w:ascii="Courier New" w:cs="Courier New" w:eastAsia="Courier New" w:hAnsi="Courier New"/>
+          <w:color w:val="2D3B36"/>
+          <w:sz w:val="18"/>
+          <w:szCs w:val="18"/>
+        </w:rPr>
+        <w:t xml:space="preserve">headers: { "Content-Type": "application/json",</w:t>
+      </w:r>
+    </w:p>
+    <w:p>
+      <w:pPr>
+        <w:spacing w:before="40" w:after="40"/>
+      </w:pPr>
+      <w:r>
+        <w:rPr>
+          <w:rFonts w:ascii="Courier New" w:cs="Courier New" w:eastAsia="Courier New" w:hAnsi="Courier New"/>
+          <w:color w:val="2D3B36"/>
+          <w:sz w:val="18"/>
+          <w:szCs w:val="18"/>
+        </w:rPr>
+        <w:t xml:space="preserve">  "x-api-key": (localStorage.getItem("ppa_api_key") || ""),</w:t>
+      </w:r>
+    </w:p>
+    <w:p>
+      <w:pPr>
+        <w:spacing w:before="40" w:after="40"/>
+      </w:pPr>
+      <w:r>
+        <w:rPr>
+          <w:rFonts w:ascii="Courier New" w:cs="Courier New" w:eastAsia="Courier New" w:hAnsi="Courier New"/>
+          <w:color w:val="2D3B36"/>
+          <w:sz w:val="18"/>
+          <w:szCs w:val="18"/>
+        </w:rPr>
+        <w:t xml:space="preserve">  "anthropic-version": "2023-06-01",</w:t>
+      </w:r>
+    </w:p>
+    <w:p>
+      <w:pPr>
+        <w:spacing w:before="40" w:after="40"/>
+      </w:pPr>
+      <w:r>
+        <w:rPr>
+          <w:rFonts w:ascii="Courier New" w:cs="Courier New" w:eastAsia="Courier New" w:hAnsi="Courier New"/>
+          <w:color w:val="2D3B36"/>
+          <w:sz w:val="18"/>
+          <w:szCs w:val="18"/>
+        </w:rPr>
+        <w:t xml:space="preserve">  "anthropic-dangerous-direct-browser-access": "true" },</w:t>
+      </w:r>
+    </w:p>
+    <w:p>
+      <w:pPr>
+        <w:spacing w:before="60" w:after="60"/>
+      </w:pPr>
+      <w:r>
+        <w:rPr>
+          <w:rFonts w:ascii="Arial" w:cs="Arial" w:eastAsia="Arial" w:hAnsi="Arial"/>
+          <w:color w:val="2D3B36"/>
+          <w:sz w:val="20"/>
+          <w:szCs w:val="20"/>
+        </w:rPr>
+        <w:t xml:space="preserve">To regenerate the PWA bundle after a source change: run node bundle.js in ppa-source/ to get a fresh ppa-speech-therapy-bundle.jsx, then re-run the Python patch script in pwa/src/.</w:t>
+      </w:r>
+    </w:p>
+    <w:p>
+      <w:pPr>
+        <w:pStyle w:val="Heading3"/>
+        <w:spacing w:before="240" w:after="80"/>
+      </w:pPr>
+      <w:r>
+        <w:rPr>
+          <w:rFonts w:ascii="Arial" w:cs="Arial" w:eastAsia="Arial" w:hAnsi="Arial"/>
+          <w:b/>
+          <w:bCs/>
+          <w:color w:val="4E8B80"/>
+          <w:sz w:val="22"/>
+          <w:szCs w:val="22"/>
+        </w:rPr>
+        <w:t xml:space="preserve">Running and installing on iPad</w:t>
+      </w:r>
+    </w:p>
+    <w:p>
+      <w:pPr>
+        <w:spacing w:before="60" w:after="40"/>
+      </w:pPr>
+      <w:r>
+        <w:rPr>
+          <w:rFonts w:ascii="Arial" w:cs="Arial" w:eastAsia="Arial" w:hAnsi="Arial"/>
+          <w:color w:val="2D3B36"/>
+          <w:sz w:val="20"/>
+          <w:szCs w:val="20"/>
+        </w:rPr>
+        <w:t xml:space="preserve">1.  Start the dev server on the Mac (must be on the same Wi-Fi as the iPad):</w:t>
+      </w:r>
+    </w:p>
+    <w:p>
+      <w:pPr>
+        <w:spacing w:before="40" w:after="40"/>
+      </w:pPr>
+      <w:r>
+        <w:rPr>
+          <w:rFonts w:ascii="Courier New" w:cs="Courier New" w:eastAsia="Courier New" w:hAnsi="Courier New"/>
+          <w:color w:val="2D3B36"/>
+          <w:sz w:val="18"/>
+          <w:szCs w:val="18"/>
+        </w:rPr>
+        <w:t xml:space="preserve">cd pwa &amp;&amp; npm run dev   # starts with --host; shows network IP</w:t>
+      </w:r>
+    </w:p>
+    <w:p>
+      <w:pPr>
+        <w:spacing w:before="60" w:after="40"/>
+      </w:pPr>
+      <w:r>
+        <w:rPr>
+          <w:rFonts w:ascii="Arial" w:cs="Arial" w:eastAsia="Arial" w:hAnsi="Arial"/>
+          <w:color w:val="2D3B36"/>
+          <w:sz w:val="20"/>
+          <w:szCs w:val="20"/>
+        </w:rPr>
+        <w:t xml:space="preserve">2.  Open the network URL (e.g. http://192.168.x.x:5173) in Safari on the iPad.</w:t>
+      </w:r>
+    </w:p>
+    <w:p>
+      <w:pPr>
+        <w:spacing w:before="60" w:after="40"/>
+      </w:pPr>
+      <w:r>
+        <w:rPr>
+          <w:rFonts w:ascii="Arial" w:cs="Arial" w:eastAsia="Arial" w:hAnsi="Arial"/>
+          <w:color w:val="2D3B36"/>
+          <w:sz w:val="20"/>
+          <w:szCs w:val="20"/>
+        </w:rPr>
+        <w:t xml:space="preserve">3.  On first load, enter the Anthropic API key on the setup screen. The key is stored in Safari’s localStorage and persists across sessions.</w:t>
+      </w:r>
+    </w:p>
+    <w:p>
+      <w:pPr>
+        <w:spacing w:before="60" w:after="40"/>
+      </w:pPr>
+      <w:r>
+        <w:rPr>
+          <w:rFonts w:ascii="Arial" w:cs="Arial" w:eastAsia="Arial" w:hAnsi="Arial"/>
+          <w:color w:val="2D3B36"/>
+          <w:sz w:val="20"/>
+          <w:szCs w:val="20"/>
+        </w:rPr>
+        <w:t xml:space="preserve">4.  To install as a home-screen app: tap Share → Add to Home Screen. The app opens full-screen without browser chrome.</w:t>
+      </w:r>
+    </w:p>
+    <w:p>
+      <w:pPr>
+        <w:pStyle w:val="Heading3"/>
+        <w:spacing w:before="240" w:after="80"/>
+      </w:pPr>
+      <w:r>
+        <w:rPr>
+          <w:rFonts w:ascii="Arial" w:cs="Arial" w:eastAsia="Arial" w:hAnsi="Arial"/>
+          <w:b/>
+          <w:bCs/>
+          <w:color w:val="4E8B80"/>
+          <w:sz w:val="22"/>
+          <w:szCs w:val="22"/>
+        </w:rPr>
+        <w:t xml:space="preserve">Service worker / offline note</w:t>
+      </w:r>
+    </w:p>
+    <w:p>
+      <w:pPr>
+        <w:spacing w:before="60" w:after="60"/>
+      </w:pPr>
+      <w:r>
+        <w:rPr>
+          <w:rFonts w:ascii="Arial" w:cs="Arial" w:eastAsia="Arial" w:hAnsi="Arial"/>
+          <w:color w:val="2D3B36"/>
+          <w:sz w:val="20"/>
+          <w:szCs w:val="20"/>
+        </w:rPr>
+        <w:t xml:space="preserve">Safari activates service workers only on HTTPS or localhost. When served over the local network (HTTP), the manifest and Add to Home Screen work normally, but the Workbox service worker will not register and the app will not be cached for offline use. To enable full offline support, host the production build (npm run build, output in pwa/dist/) on an HTTPS server such as GitHub Pages or Netlify.</w:t>
       </w:r>
     </w:p>
     <w:p>

</xml_diff>